<commit_message>
docs: regenerate document set and add zero-cost distribution runbook
</commit_message>
<xml_diff>
--- a/docs/PD_Data_Retention_Policy_v1.0.docx
+++ b/docs/PD_Data_Retention_Policy_v1.0.docx
@@ -994,73 +994,73 @@
                 <w:sz w:val="18"/>
                 <w:szCs w:val="18"/>
               </w:rPr>
-              <w:t xml:space="preserve">In-memory API cache</w:t>
-            </w:r>
-          </w:p>
-        </w:tc>
-        <w:tc>
-          <w:tcPr>
-            <w:tcMar>
-              <w:top w:type="dxa" w:w="60"/>
-              <w:left w:type="dxa" w:w="90"/>
-              <w:bottom w:type="dxa" w:w="60"/>
-              <w:right w:type="dxa" w:w="90"/>
-            </w:tcMar>
-          </w:tcPr>
-          <w:p>
-            <w:r>
-              <w:rPr>
-                <w:b w:val="false"/>
-                <w:bCs w:val="false"/>
-                <w:color w:val="1B2138"/>
-                <w:sz w:val="18"/>
-                <w:szCs w:val="18"/>
-              </w:rPr>
-              <w:t xml:space="preserve">Recent third-party responses</w:t>
-            </w:r>
-          </w:p>
-        </w:tc>
-        <w:tc>
-          <w:tcPr>
-            <w:tcMar>
-              <w:top w:type="dxa" w:w="60"/>
-              <w:left w:type="dxa" w:w="90"/>
-              <w:bottom w:type="dxa" w:w="60"/>
-              <w:right w:type="dxa" w:w="90"/>
-            </w:tcMar>
-          </w:tcPr>
-          <w:p>
-            <w:r>
-              <w:rPr>
-                <w:b w:val="false"/>
-                <w:bCs w:val="false"/>
-                <w:color w:val="1B2138"/>
-                <w:sz w:val="18"/>
-                <w:szCs w:val="18"/>
-              </w:rPr>
-              <w:t xml:space="preserve">Discarded when the process exits; TTL 2–360 minutes</w:t>
-            </w:r>
-          </w:p>
-        </w:tc>
-        <w:tc>
-          <w:tcPr>
-            <w:tcMar>
-              <w:top w:type="dxa" w:w="60"/>
-              <w:left w:type="dxa" w:w="90"/>
-              <w:bottom w:type="dxa" w:w="60"/>
-              <w:right w:type="dxa" w:w="90"/>
-            </w:tcMar>
-          </w:tcPr>
-          <w:p>
-            <w:r>
-              <w:rPr>
-                <w:b w:val="false"/>
-                <w:bCs w:val="false"/>
-                <w:color w:val="1B2138"/>
-                <w:sz w:val="18"/>
-                <w:szCs w:val="18"/>
-              </w:rPr>
-              <w:t xml:space="preserve">Rate-limit protection</w:t>
+              <w:t xml:space="preserve">Browser app data (web build)</w:t>
+            </w:r>
+          </w:p>
+        </w:tc>
+        <w:tc>
+          <w:tcPr>
+            <w:tcMar>
+              <w:top w:type="dxa" w:w="60"/>
+              <w:left w:type="dxa" w:w="90"/>
+              <w:bottom w:type="dxa" w:w="60"/>
+              <w:right w:type="dxa" w:w="90"/>
+            </w:tcMar>
+          </w:tcPr>
+          <w:p>
+            <w:r>
+              <w:rPr>
+                <w:b w:val="false"/>
+                <w:bCs w:val="false"/>
+                <w:color w:val="1B2138"/>
+                <w:sz w:val="18"/>
+                <w:szCs w:val="18"/>
+              </w:rPr>
+              <w:t xml:space="preserve">Holdings, base currency, cash, settings, value history, random visitor id</w:t>
+            </w:r>
+          </w:p>
+        </w:tc>
+        <w:tc>
+          <w:tcPr>
+            <w:tcMar>
+              <w:top w:type="dxa" w:w="60"/>
+              <w:left w:type="dxa" w:w="90"/>
+              <w:bottom w:type="dxa" w:w="60"/>
+              <w:right w:type="dxa" w:w="90"/>
+            </w:tcMar>
+          </w:tcPr>
+          <w:p>
+            <w:r>
+              <w:rPr>
+                <w:b w:val="false"/>
+                <w:bCs w:val="false"/>
+                <w:color w:val="1B2138"/>
+                <w:sz w:val="18"/>
+                <w:szCs w:val="18"/>
+              </w:rPr>
+              <w:t xml:space="preserve">Held until the user clears site data for the domain</w:t>
+            </w:r>
+          </w:p>
+        </w:tc>
+        <w:tc>
+          <w:tcPr>
+            <w:tcMar>
+              <w:top w:type="dxa" w:w="60"/>
+              <w:left w:type="dxa" w:w="90"/>
+              <w:bottom w:type="dxa" w:w="60"/>
+              <w:right w:type="dxa" w:w="90"/>
+            </w:tcMar>
+          </w:tcPr>
+          <w:p>
+            <w:r>
+              <w:rPr>
+                <w:b w:val="false"/>
+                <w:bCs w:val="false"/>
+                <w:color w:val="1B2138"/>
+                <w:sz w:val="18"/>
+                <w:szCs w:val="18"/>
+              </w:rPr>
+              <w:t xml:space="preserve">User instruction — the web build stores nothing on a server</w:t>
             </w:r>
           </w:p>
         </w:tc>
@@ -1085,13 +1085,289 @@
                 <w:sz w:val="18"/>
                 <w:szCs w:val="18"/>
               </w:rPr>
+              <w:t xml:space="preserve">Usage events (web build)</w:t>
+            </w:r>
+          </w:p>
+        </w:tc>
+        <w:tc>
+          <w:tcPr>
+            <w:shd w:fill="F2F4FB"/>
+            <w:tcMar>
+              <w:top w:type="dxa" w:w="60"/>
+              <w:left w:type="dxa" w:w="90"/>
+              <w:bottom w:type="dxa" w:w="60"/>
+              <w:right w:type="dxa" w:w="90"/>
+            </w:tcMar>
+          </w:tcPr>
+          <w:p>
+            <w:r>
+              <w:rPr>
+                <w:b w:val="false"/>
+                <w:bCs w:val="false"/>
+                <w:color w:val="1B2138"/>
+                <w:sz w:val="18"/>
+                <w:szCs w:val="18"/>
+              </w:rPr>
+              <w:t xml:space="preserve">Random visitor id, date, timestamp, open or heartbeat, platform, two-letter country</w:t>
+            </w:r>
+          </w:p>
+        </w:tc>
+        <w:tc>
+          <w:tcPr>
+            <w:shd w:fill="F2F4FB"/>
+            <w:tcMar>
+              <w:top w:type="dxa" w:w="60"/>
+              <w:left w:type="dxa" w:w="90"/>
+              <w:bottom w:type="dxa" w:w="60"/>
+              <w:right w:type="dxa" w:w="90"/>
+            </w:tcMar>
+          </w:tcPr>
+          <w:p>
+            <w:r>
+              <w:rPr>
+                <w:b w:val="false"/>
+                <w:bCs w:val="false"/>
+                <w:color w:val="1B2138"/>
+                <w:sz w:val="18"/>
+                <w:szCs w:val="18"/>
+              </w:rPr>
+              <w:t xml:space="preserve">Rolling 90 days, older rows deleted automatically</w:t>
+            </w:r>
+          </w:p>
+        </w:tc>
+        <w:tc>
+          <w:tcPr>
+            <w:shd w:fill="F2F4FB"/>
+            <w:tcMar>
+              <w:top w:type="dxa" w:w="60"/>
+              <w:left w:type="dxa" w:w="90"/>
+              <w:bottom w:type="dxa" w:w="60"/>
+              <w:right w:type="dxa" w:w="90"/>
+            </w:tcMar>
+          </w:tcPr>
+          <w:p>
+            <w:r>
+              <w:rPr>
+                <w:b w:val="false"/>
+                <w:bCs w:val="false"/>
+                <w:color w:val="1B2138"/>
+                <w:sz w:val="18"/>
+                <w:szCs w:val="18"/>
+              </w:rPr>
+              <w:t xml:space="preserve">Legitimate interest in knowing how many devices use the app; no identifier, IP, cookie or account is stored</w:t>
+            </w:r>
+          </w:p>
+        </w:tc>
+      </w:tr>
+      <w:tr>
+        <w:tc>
+          <w:tcPr>
+            <w:tcMar>
+              <w:top w:type="dxa" w:w="60"/>
+              <w:left w:type="dxa" w:w="90"/>
+              <w:bottom w:type="dxa" w:w="60"/>
+              <w:right w:type="dxa" w:w="90"/>
+            </w:tcMar>
+          </w:tcPr>
+          <w:p>
+            <w:r>
+              <w:rPr>
+                <w:b w:val="false"/>
+                <w:bCs w:val="false"/>
+                <w:color w:val="1B2138"/>
+                <w:sz w:val="18"/>
+                <w:szCs w:val="18"/>
+              </w:rPr>
+              <w:t xml:space="preserve">In-memory API cache</w:t>
+            </w:r>
+          </w:p>
+        </w:tc>
+        <w:tc>
+          <w:tcPr>
+            <w:tcMar>
+              <w:top w:type="dxa" w:w="60"/>
+              <w:left w:type="dxa" w:w="90"/>
+              <w:bottom w:type="dxa" w:w="60"/>
+              <w:right w:type="dxa" w:w="90"/>
+            </w:tcMar>
+          </w:tcPr>
+          <w:p>
+            <w:r>
+              <w:rPr>
+                <w:b w:val="false"/>
+                <w:bCs w:val="false"/>
+                <w:color w:val="1B2138"/>
+                <w:sz w:val="18"/>
+                <w:szCs w:val="18"/>
+              </w:rPr>
+              <w:t xml:space="preserve">Recent third-party responses</w:t>
+            </w:r>
+          </w:p>
+        </w:tc>
+        <w:tc>
+          <w:tcPr>
+            <w:tcMar>
+              <w:top w:type="dxa" w:w="60"/>
+              <w:left w:type="dxa" w:w="90"/>
+              <w:bottom w:type="dxa" w:w="60"/>
+              <w:right w:type="dxa" w:w="90"/>
+            </w:tcMar>
+          </w:tcPr>
+          <w:p>
+            <w:r>
+              <w:rPr>
+                <w:b w:val="false"/>
+                <w:bCs w:val="false"/>
+                <w:color w:val="1B2138"/>
+                <w:sz w:val="18"/>
+                <w:szCs w:val="18"/>
+              </w:rPr>
+              <w:t xml:space="preserve">Discarded when the process exits; TTL 2–360 minutes</w:t>
+            </w:r>
+          </w:p>
+        </w:tc>
+        <w:tc>
+          <w:tcPr>
+            <w:tcMar>
+              <w:top w:type="dxa" w:w="60"/>
+              <w:left w:type="dxa" w:w="90"/>
+              <w:bottom w:type="dxa" w:w="60"/>
+              <w:right w:type="dxa" w:w="90"/>
+            </w:tcMar>
+          </w:tcPr>
+          <w:p>
+            <w:r>
+              <w:rPr>
+                <w:b w:val="false"/>
+                <w:bCs w:val="false"/>
+                <w:color w:val="1B2138"/>
+                <w:sz w:val="18"/>
+                <w:szCs w:val="18"/>
+              </w:rPr>
+              <w:t xml:space="preserve">Rate-limit protection</w:t>
+            </w:r>
+          </w:p>
+        </w:tc>
+      </w:tr>
+      <w:tr>
+        <w:tc>
+          <w:tcPr>
+            <w:shd w:fill="F2F4FB"/>
+            <w:tcMar>
+              <w:top w:type="dxa" w:w="60"/>
+              <w:left w:type="dxa" w:w="90"/>
+              <w:bottom w:type="dxa" w:w="60"/>
+              <w:right w:type="dxa" w:w="90"/>
+            </w:tcMar>
+          </w:tcPr>
+          <w:p>
+            <w:r>
+              <w:rPr>
+                <w:b w:val="false"/>
+                <w:bCs w:val="false"/>
+                <w:color w:val="1B2138"/>
+                <w:sz w:val="18"/>
+                <w:szCs w:val="18"/>
+              </w:rPr>
+              <w:t xml:space="preserve">Edge cache</w:t>
+            </w:r>
+          </w:p>
+        </w:tc>
+        <w:tc>
+          <w:tcPr>
+            <w:shd w:fill="F2F4FB"/>
+            <w:tcMar>
+              <w:top w:type="dxa" w:w="60"/>
+              <w:left w:type="dxa" w:w="90"/>
+              <w:bottom w:type="dxa" w:w="60"/>
+              <w:right w:type="dxa" w:w="90"/>
+            </w:tcMar>
+          </w:tcPr>
+          <w:p>
+            <w:r>
+              <w:rPr>
+                <w:b w:val="false"/>
+                <w:bCs w:val="false"/>
+                <w:color w:val="1B2138"/>
+                <w:sz w:val="18"/>
+                <w:szCs w:val="18"/>
+              </w:rPr>
+              <w:t xml:space="preserve">Market, news and weather responses shared across all users</w:t>
+            </w:r>
+          </w:p>
+        </w:tc>
+        <w:tc>
+          <w:tcPr>
+            <w:shd w:fill="F2F4FB"/>
+            <w:tcMar>
+              <w:top w:type="dxa" w:w="60"/>
+              <w:left w:type="dxa" w:w="90"/>
+              <w:bottom w:type="dxa" w:w="60"/>
+              <w:right w:type="dxa" w:w="90"/>
+            </w:tcMar>
+          </w:tcPr>
+          <w:p>
+            <w:r>
+              <w:rPr>
+                <w:b w:val="false"/>
+                <w:bCs w:val="false"/>
+                <w:color w:val="1B2138"/>
+                <w:sz w:val="18"/>
+                <w:szCs w:val="18"/>
+              </w:rPr>
+              <w:t xml:space="preserve">Expires automatically after 60 s to 30 min</w:t>
+            </w:r>
+          </w:p>
+        </w:tc>
+        <w:tc>
+          <w:tcPr>
+            <w:shd w:fill="F2F4FB"/>
+            <w:tcMar>
+              <w:top w:type="dxa" w:w="60"/>
+              <w:left w:type="dxa" w:w="90"/>
+              <w:bottom w:type="dxa" w:w="60"/>
+              <w:right w:type="dxa" w:w="90"/>
+            </w:tcMar>
+          </w:tcPr>
+          <w:p>
+            <w:r>
+              <w:rPr>
+                <w:b w:val="false"/>
+                <w:bCs w:val="false"/>
+                <w:color w:val="1B2138"/>
+                <w:sz w:val="18"/>
+                <w:szCs w:val="18"/>
+              </w:rPr>
+              <w:t xml:space="preserve">Rate-limit protection; contains no user data</w:t>
+            </w:r>
+          </w:p>
+        </w:tc>
+      </w:tr>
+      <w:tr>
+        <w:tc>
+          <w:tcPr>
+            <w:tcMar>
+              <w:top w:type="dxa" w:w="60"/>
+              <w:left w:type="dxa" w:w="90"/>
+              <w:bottom w:type="dxa" w:w="60"/>
+              <w:right w:type="dxa" w:w="90"/>
+            </w:tcMar>
+          </w:tcPr>
+          <w:p>
+            <w:r>
+              <w:rPr>
+                <w:b w:val="false"/>
+                <w:bCs w:val="false"/>
+                <w:color w:val="1B2138"/>
+                <w:sz w:val="18"/>
+                <w:szCs w:val="18"/>
+              </w:rPr>
               <w:t xml:space="preserve">Chromium cache</w:t>
             </w:r>
           </w:p>
         </w:tc>
         <w:tc>
           <w:tcPr>
-            <w:shd w:fill="F2F4FB"/>
             <w:tcMar>
               <w:top w:type="dxa" w:w="60"/>
               <w:left w:type="dxa" w:w="90"/>
@@ -1114,7 +1390,6 @@
         </w:tc>
         <w:tc>
           <w:tcPr>
-            <w:shd w:fill="F2F4FB"/>
             <w:tcMar>
               <w:top w:type="dxa" w:w="60"/>
               <w:left w:type="dxa" w:w="90"/>
@@ -1137,7 +1412,6 @@
         </w:tc>
         <w:tc>
           <w:tcPr>
-            <w:shd w:fill="F2F4FB"/>
             <w:tcMar>
               <w:top w:type="dxa" w:w="60"/>
               <w:left w:type="dxa" w:w="90"/>

</xml_diff>